<commit_message>
Website résumé: list updated character references
Co-Authored-By: Claude Sonnet 5.5 <noreply@anthropic.com>
</commit_message>
<xml_diff>
--- a/Jayson-Jadraque-Resume.docx
+++ b/Jayson-Jadraque-Resume.docx
@@ -1160,10 +1160,66 @@
       <w:r>
         <w:rPr>
           <w:rFonts w:ascii="Calibri" w:cs="Calibri" w:eastAsia="Calibri" w:hAnsi="Calibri"/>
-          <w:sz w:val="20"/>
-          <w:szCs w:val="20"/>
-        </w:rPr>
-        <w:t xml:space="preserve">Available upon request.</w:t>
+          <w:b/>
+          <w:bCs/>
+          <w:sz w:val="20"/>
+          <w:szCs w:val="20"/>
+        </w:rPr>
+        <w:t xml:space="preserve">Kent Allysson Ceballos</w:t>
+      </w:r>
+      <w:r>
+        <w:rPr>
+          <w:rFonts w:ascii="Calibri" w:cs="Calibri" w:eastAsia="Calibri" w:hAnsi="Calibri"/>
+          <w:sz w:val="20"/>
+          <w:szCs w:val="20"/>
+        </w:rPr>
+        <w:t xml:space="preserve"> — iOS Developer, Forty Degrees Celsius Inc. (FDCI) · 09295071467</w:t>
+      </w:r>
+    </w:p>
+    <w:p>
+      <w:pPr>
+        <w:spacing w:after="40" w:before="0"/>
+      </w:pPr>
+      <w:r>
+        <w:rPr>
+          <w:rFonts w:ascii="Calibri" w:cs="Calibri" w:eastAsia="Calibri" w:hAnsi="Calibri"/>
+          <w:b/>
+          <w:bCs/>
+          <w:sz w:val="20"/>
+          <w:szCs w:val="20"/>
+        </w:rPr>
+        <w:t xml:space="preserve">Jose Marie Ylaya</w:t>
+      </w:r>
+      <w:r>
+        <w:rPr>
+          <w:rFonts w:ascii="Calibri" w:cs="Calibri" w:eastAsia="Calibri" w:hAnsi="Calibri"/>
+          <w:sz w:val="20"/>
+          <w:szCs w:val="20"/>
+        </w:rPr>
+        <w:t xml:space="preserve"> — Web Developer &amp; AI Developer (AI Team), Forty Degrees Celsius Inc. (FDCI) · 09686499611</w:t>
+      </w:r>
+    </w:p>
+    <w:p>
+      <w:pPr>
+        <w:spacing w:after="40" w:before="0"/>
+      </w:pPr>
+      <w:r>
+        <w:rPr>
+          <w:rFonts w:ascii="Calibri" w:cs="Calibri" w:eastAsia="Calibri" w:hAnsi="Calibri"/>
+          <w:b/>
+          <w:bCs/>
+          <w:sz w:val="20"/>
+          <w:szCs w:val="20"/>
+        </w:rPr>
+        <w:t xml:space="preserve">Bryle James U. Gabunada</w:t>
+      </w:r>
+      <w:r>
+        <w:rPr>
+          <w:rFonts w:ascii="Calibri" w:cs="Calibri" w:eastAsia="Calibri" w:hAnsi="Calibri"/>
+          <w:sz w:val="20"/>
+          <w:szCs w:val="20"/>
+        </w:rPr>
+        <w:t xml:space="preserve"> — AI/ML Computational Science Sr. Analyst, Accenture in the Philippines · gabunadame@gmail.com · 09462529143</w:t>
       </w:r>
     </w:p>
     <w:sectPr>

</xml_diff>

<commit_message>
Use new professional headshot on site, share card and résumé header
Co-Authored-By: Claude Sonnet 5.5 <noreply@anthropic.com>
</commit_message>
<xml_diff>
--- a/Jayson-Jadraque-Resume.docx
+++ b/Jayson-Jadraque-Resume.docx
@@ -2,35 +2,123 @@
 <file path=word/document.xml><?xml version="1.0" encoding="utf-8"?>
 <w:document xmlns:wpc="http://schemas.microsoft.com/office/word/2010/wordprocessingCanvas" xmlns:mc="http://schemas.openxmlformats.org/markup-compatibility/2006" xmlns:o="urn:schemas-microsoft-com:office:office" xmlns:r="http://schemas.openxmlformats.org/officeDocument/2006/relationships" xmlns:m="http://schemas.openxmlformats.org/officeDocument/2006/math" xmlns:v="urn:schemas-microsoft-com:vml" xmlns:wp14="http://schemas.microsoft.com/office/word/2010/wordprocessingDrawing" xmlns:wp="http://schemas.openxmlformats.org/drawingml/2006/wordprocessingDrawing" xmlns:w10="urn:schemas-microsoft-com:office:word" xmlns:w="http://schemas.openxmlformats.org/wordprocessingml/2006/main" xmlns:w14="http://schemas.microsoft.com/office/word/2010/wordml" xmlns:w15="http://schemas.microsoft.com/office/word/2012/wordml" xmlns:wpg="http://schemas.microsoft.com/office/word/2010/wordprocessingGroup" xmlns:wpi="http://schemas.microsoft.com/office/word/2010/wordprocessingInk" xmlns:wne="http://schemas.microsoft.com/office/word/2006/wordml" xmlns:wps="http://schemas.microsoft.com/office/word/2010/wordprocessingShape" xmlns:cx="http://schemas.microsoft.com/office/drawing/2014/chartex" xmlns:cx1="http://schemas.microsoft.com/office/drawing/2015/9/8/chartex" xmlns:cx2="http://schemas.microsoft.com/office/drawing/2015/10/21/chartex" xmlns:cx3="http://schemas.microsoft.com/office/drawing/2016/5/9/chartex" xmlns:cx4="http://schemas.microsoft.com/office/drawing/2016/5/10/chartex" xmlns:cx5="http://schemas.microsoft.com/office/drawing/2016/5/11/chartex" xmlns:cx6="http://schemas.microsoft.com/office/drawing/2016/5/12/chartex" xmlns:cx7="http://schemas.microsoft.com/office/drawing/2016/5/13/chartex" xmlns:cx8="http://schemas.microsoft.com/office/drawing/2016/5/14/chartex" xmlns:aink="http://schemas.microsoft.com/office/drawing/2016/ink" xmlns:am3d="http://schemas.microsoft.com/office/drawing/2017/model3d" xmlns:w16cex="http://schemas.microsoft.com/office/word/2018/wordml/cex" xmlns:w16cid="http://schemas.microsoft.com/office/word/2016/wordml/cid" xmlns:w16="http://schemas.microsoft.com/office/word/2018/wordml" xmlns:w16sdtdh="http://schemas.microsoft.com/office/word/2020/wordml/sdtdatahash" xmlns:w16se="http://schemas.microsoft.com/office/word/2015/wordml/symex" mc:Ignorable="w14 w15 wp14">
   <w:body>
-    <w:p>
-      <w:pPr>
-        <w:spacing w:after="20"/>
-      </w:pPr>
-      <w:r>
-        <w:rPr>
-          <w:rFonts w:ascii="Calibri" w:cs="Calibri" w:eastAsia="Calibri" w:hAnsi="Calibri"/>
-          <w:b/>
-          <w:bCs/>
-          <w:sz w:val="44"/>
-          <w:szCs w:val="44"/>
-        </w:rPr>
-        <w:t xml:space="preserve">JAYSON L. JADRAQUE</w:t>
-      </w:r>
-    </w:p>
-    <w:p>
-      <w:pPr>
-        <w:spacing w:after="40" w:before="0"/>
-      </w:pPr>
-      <w:r>
-        <w:rPr>
-          <w:rFonts w:ascii="Calibri" w:cs="Calibri" w:eastAsia="Calibri" w:hAnsi="Calibri"/>
-          <w:color w:val="444444"/>
-          <w:sz w:val="22"/>
-          <w:szCs w:val="22"/>
-        </w:rPr>
-        <w:t xml:space="preserve">Solutions Architect · AI Team Lead · Full-Stack Developer</w:t>
-      </w:r>
-    </w:p>
+    <w:tbl>
+      <w:tblPr>
+        <w:tblW w:type="dxa" w:w="10206"/>
+        <w:tblBorders>
+          <w:top w:val="none" w:color="FFFFFF" w:sz="0"/>
+          <w:left w:val="none" w:color="FFFFFF" w:sz="0"/>
+          <w:bottom w:val="none" w:color="FFFFFF" w:sz="0"/>
+          <w:right w:val="none" w:color="FFFFFF" w:sz="0"/>
+          <w:insideH w:val="none" w:color="FFFFFF" w:sz="0"/>
+          <w:insideV w:val="none" w:color="FFFFFF" w:sz="0"/>
+        </w:tblBorders>
+      </w:tblPr>
+      <w:tblGrid>
+        <w:gridCol w:w="8506"/>
+        <w:gridCol w:w="1700"/>
+      </w:tblGrid>
+      <w:tr>
+        <w:tc>
+          <w:tcPr>
+            <w:tcW w:type="dxa" w:w="8506"/>
+            <w:tcBorders>
+              <w:top w:val="none" w:color="FFFFFF" w:sz="0"/>
+              <w:left w:val="none" w:color="FFFFFF" w:sz="0"/>
+              <w:bottom w:val="none" w:color="FFFFFF" w:sz="0"/>
+              <w:right w:val="none" w:color="FFFFFF" w:sz="0"/>
+            </w:tcBorders>
+            <w:vAlign w:val="center"/>
+          </w:tcPr>
+          <w:p>
+            <w:pPr>
+              <w:spacing w:after="20"/>
+            </w:pPr>
+            <w:r>
+              <w:rPr>
+                <w:rFonts w:ascii="Calibri" w:cs="Calibri" w:eastAsia="Calibri" w:hAnsi="Calibri"/>
+                <w:b/>
+                <w:bCs/>
+                <w:sz w:val="44"/>
+                <w:szCs w:val="44"/>
+              </w:rPr>
+              <w:t xml:space="preserve">JAYSON L. JADRAQUE</w:t>
+            </w:r>
+          </w:p>
+          <w:p>
+            <w:pPr>
+              <w:spacing w:after="40"/>
+            </w:pPr>
+            <w:r>
+              <w:rPr>
+                <w:rFonts w:ascii="Calibri" w:cs="Calibri" w:eastAsia="Calibri" w:hAnsi="Calibri"/>
+                <w:color w:val="444444"/>
+                <w:sz w:val="22"/>
+                <w:szCs w:val="22"/>
+              </w:rPr>
+              <w:t xml:space="preserve">Solutions Architect · AI Team Lead · Full-Stack Developer</w:t>
+            </w:r>
+          </w:p>
+        </w:tc>
+        <w:tc>
+          <w:tcPr>
+            <w:tcW w:type="dxa" w:w="1700"/>
+            <w:tcBorders>
+              <w:top w:val="none" w:color="FFFFFF" w:sz="0"/>
+              <w:left w:val="none" w:color="FFFFFF" w:sz="0"/>
+              <w:bottom w:val="none" w:color="FFFFFF" w:sz="0"/>
+              <w:right w:val="none" w:color="FFFFFF" w:sz="0"/>
+            </w:tcBorders>
+            <w:vAlign w:val="center"/>
+          </w:tcPr>
+          <w:p>
+            <w:pPr>
+              <w:jc w:val="right"/>
+            </w:pPr>
+            <w:r>
+              <w:drawing>
+                <wp:inline distT="0" distB="0" distL="0" distR="0">
+                  <wp:extent cx="838200" cy="838200"/>
+                  <wp:effectExtent t="0" r="0" b="0" l="0"/>
+                  <wp:docPr id="1" name="headshot" descr="Jayson Jadraque" title="Headshot"/>
+                  <wp:cNvGraphicFramePr>
+                    <a:graphicFrameLocks xmlns:a="http://schemas.openxmlformats.org/drawingml/2006/main" noChangeAspect="1"/>
+                  </wp:cNvGraphicFramePr>
+                  <a:graphic xmlns:a="http://schemas.openxmlformats.org/drawingml/2006/main">
+                    <a:graphicData uri="http://schemas.openxmlformats.org/drawingml/2006/picture">
+                      <pic:pic xmlns:pic="http://schemas.openxmlformats.org/drawingml/2006/picture">
+                        <pic:nvPicPr>
+                          <pic:cNvPr id="0" name="" descr=""/>
+                          <pic:cNvPicPr>
+                            <a:picLocks noChangeAspect="1" noChangeArrowheads="1"/>
+                          </pic:cNvPicPr>
+                        </pic:nvPicPr>
+                        <pic:blipFill>
+                          <a:blip r:embed="rId7" cstate="none"/>
+                          <a:srcRect/>
+                          <a:stretch>
+                            <a:fillRect/>
+                          </a:stretch>
+                        </pic:blipFill>
+                        <pic:spPr bwMode="auto">
+                          <a:xfrm>
+                            <a:off x="0" y="0"/>
+                            <a:ext cx="838200" cy="838200"/>
+                          </a:xfrm>
+                          <a:prstGeom prst="rect">
+                            <a:avLst/>
+                          </a:prstGeom>
+                        </pic:spPr>
+                      </pic:pic>
+                    </a:graphicData>
+                  </a:graphic>
+                </wp:inline>
+              </w:drawing>
+            </w:r>
+          </w:p>
+        </w:tc>
+      </w:tr>
+    </w:tbl>
     <w:p>
       <w:pPr>
         <w:pBdr>

</xml_diff>

<commit_message>
Website résumé: merged master (AI engineering + full-stack, all projects)
Co-Authored-By: Claude Sonnet 5.5 <noreply@anthropic.com>
</commit_message>
<xml_diff>
--- a/Jayson-Jadraque-Resume.docx
+++ b/Jayson-Jadraque-Resume.docx
@@ -142,7 +142,7 @@
         <w:pBdr>
           <w:bottom w:val="single" w:color="BBBBBB" w:sz="6" w:space="2"/>
         </w:pBdr>
-        <w:spacing w:after="70" w:before="200"/>
+        <w:spacing w:after="60" w:before="140"/>
       </w:pPr>
       <w:r>
         <w:rPr>
@@ -157,15 +157,15 @@
     </w:p>
     <w:p>
       <w:pPr>
-        <w:spacing w:after="40" w:before="0"/>
-      </w:pPr>
-      <w:r>
-        <w:rPr>
-          <w:rFonts w:ascii="Calibri" w:cs="Calibri" w:eastAsia="Calibri" w:hAnsi="Calibri"/>
-          <w:sz w:val="20"/>
-          <w:szCs w:val="20"/>
-        </w:rPr>
-        <w:t xml:space="preserve">Results-driven Solutions Architect, AI Team Lead and Full-Stack Developer with 7 years of experience building scalable web applications, mobile apps and AI-powered solutions. Proven track record designing enterprise-grade architectures, leading AI development teams, and integrating AI chat support, chatbots and automation workflows into existing production systems using Dify, n8n and the Claude and OpenAI APIs. Advanced daily Claude user (Claude Code and the Anthropic API) who runs a spec-driven development process with Spec Kit. Experienced in the full development lifecycle, from server setup and deployment to mentoring junior developers. Builds personal AI products on local models (Ollama, LTX, mflux), including an AI-driven YouTube content pipeline.</w:t>
+        <w:spacing w:after="40"/>
+      </w:pPr>
+      <w:r>
+        <w:rPr>
+          <w:rFonts w:ascii="Calibri" w:cs="Calibri" w:eastAsia="Calibri" w:hAnsi="Calibri"/>
+          <w:sz w:val="20"/>
+          <w:szCs w:val="20"/>
+        </w:rPr>
+        <w:t xml:space="preserve">Solutions Architect, AI Team Lead and Full-Stack Developer with 7 years of experience designing, building and shipping scalable web platforms and AI-powered systems. For the last 3 years I have led an AI team delivering production chatbots, automation workflows and AI features inside existing products (such as NativeCamp, serving Japan) using Dify, n8n and the Claude, OpenAI and Gemini APIs. Daily Claude Code user who runs spec-driven development with Spec Kit. Strong full-stack foundation (TypeScript/Node, Next.js, NestJS, PHP/Laravel, PostgreSQL/MySQL, Docker, CI/CD), with enterprise architecture, code review and mentoring experience. Builds personal AI products on local models (Ollama, LTX, mflux). Turns business problems into prototypes and production systems, and explains decisions clearly to technical and non-technical stakeholders.</w:t>
       </w:r>
     </w:p>
     <w:p>
@@ -174,7 +174,7 @@
         <w:pBdr>
           <w:bottom w:val="single" w:color="BBBBBB" w:sz="6" w:space="2"/>
         </w:pBdr>
-        <w:spacing w:after="70" w:before="200"/>
+        <w:spacing w:after="60" w:before="140"/>
       </w:pPr>
       <w:r>
         <w:rPr>
@@ -203,15 +203,15 @@
           <w:sz w:val="20"/>
           <w:szCs w:val="20"/>
         </w:rPr>
-        <w:t xml:space="preserve">Languages</w:t>
-      </w:r>
-      <w:r>
-        <w:rPr>
-          <w:rFonts w:ascii="Calibri" w:cs="Calibri" w:eastAsia="Calibri" w:hAnsi="Calibri"/>
-          <w:sz w:val="20"/>
-          <w:szCs w:val="20"/>
-        </w:rPr>
-        <w:t xml:space="preserve">	PHP 8 (proficient), JavaScript, TypeScript, jQuery, Python, HTML/CSS/SCSS</w:t>
+        <w:t xml:space="preserve">AI Engineering</w:t>
+      </w:r>
+      <w:r>
+        <w:rPr>
+          <w:rFonts w:ascii="Calibri" w:cs="Calibri" w:eastAsia="Calibri" w:hAnsi="Calibri"/>
+          <w:sz w:val="20"/>
+          <w:szCs w:val="20"/>
+        </w:rPr>
+        <w:t xml:space="preserve">	LLM APIs (Anthropic Claude, OpenAI, Google Gemini, Ollama local models), prompt and context engineering, tool calling, AI agents and multi-step workflows, knowledge-base-grounded chat, provider abstraction and retry handling, AI chatbot and chat-support development</w:t>
       </w:r>
     </w:p>
     <w:p>
@@ -230,15 +230,15 @@
           <w:sz w:val="20"/>
           <w:szCs w:val="20"/>
         </w:rPr>
-        <w:t xml:space="preserve">Frontend</w:t>
-      </w:r>
-      <w:r>
-        <w:rPr>
-          <w:rFonts w:ascii="Calibri" w:cs="Calibri" w:eastAsia="Calibri" w:hAnsi="Calibri"/>
-          <w:sz w:val="20"/>
-          <w:szCs w:val="20"/>
-        </w:rPr>
-        <w:t xml:space="preserve">	React.js, Next.js, Vue.js, React Native, Tailwind CSS, Bootstrap</w:t>
+        <w:t xml:space="preserve">AI-Assisted Dev</w:t>
+      </w:r>
+      <w:r>
+        <w:rPr>
+          <w:rFonts w:ascii="Calibri" w:cs="Calibri" w:eastAsia="Calibri" w:hAnsi="Calibri"/>
+          <w:sz w:val="20"/>
+          <w:szCs w:val="20"/>
+        </w:rPr>
+        <w:t xml:space="preserve">	Claude Code (daily), Spec Kit (spec-driven development), AI for coding, debugging, testing, documentation and rapid prototyping, vibe coding with code review</w:t>
       </w:r>
     </w:p>
     <w:p>
@@ -257,15 +257,15 @@
           <w:sz w:val="20"/>
           <w:szCs w:val="20"/>
         </w:rPr>
-        <w:t xml:space="preserve">Backend &amp; API</w:t>
-      </w:r>
-      <w:r>
-        <w:rPr>
-          <w:rFonts w:ascii="Calibri" w:cs="Calibri" w:eastAsia="Calibri" w:hAnsi="Calibri"/>
-          <w:sz w:val="20"/>
-          <w:szCs w:val="20"/>
-        </w:rPr>
-        <w:t xml:space="preserve">	Node.js, CakePHP, Laravel, CodeIgniter, NestJS, RESTful APIs, MVC architecture</w:t>
+        <w:t xml:space="preserve">Automation</w:t>
+      </w:r>
+      <w:r>
+        <w:rPr>
+          <w:rFonts w:ascii="Calibri" w:cs="Calibri" w:eastAsia="Calibri" w:hAnsi="Calibri"/>
+          <w:sz w:val="20"/>
+          <w:szCs w:val="20"/>
+        </w:rPr>
+        <w:t xml:space="preserve">	Dify, n8n (LLM + API + database + chat-channel workflows)</w:t>
       </w:r>
     </w:p>
     <w:p>
@@ -284,15 +284,15 @@
           <w:sz w:val="20"/>
           <w:szCs w:val="20"/>
         </w:rPr>
-        <w:t xml:space="preserve">AI &amp; Automation</w:t>
-      </w:r>
-      <w:r>
-        <w:rPr>
-          <w:rFonts w:ascii="Calibri" w:cs="Calibri" w:eastAsia="Calibri" w:hAnsi="Calibri"/>
-          <w:sz w:val="20"/>
-          <w:szCs w:val="20"/>
-        </w:rPr>
-        <w:t xml:space="preserve">	Dify, n8n, Claude (Anthropic API, Claude Code), OpenAI API, AI Chatbot &amp; Chat Support Development, Prompt Engineering, Spec Kit (spec-driven development), Vibe Coding</w:t>
+        <w:t xml:space="preserve">Voice &amp; Multimodal</w:t>
+      </w:r>
+      <w:r>
+        <w:rPr>
+          <w:rFonts w:ascii="Calibri" w:cs="Calibri" w:eastAsia="Calibri" w:hAnsi="Calibri"/>
+          <w:sz w:val="20"/>
+          <w:szCs w:val="20"/>
+        </w:rPr>
+        <w:t xml:space="preserve">	Speech-to-text (faster-whisper), text-to-speech, AI image generation (FLUX / mflux), AI video generation (LTX), voice-based assistants</w:t>
       </w:r>
     </w:p>
     <w:p>
@@ -311,15 +311,15 @@
           <w:sz w:val="20"/>
           <w:szCs w:val="20"/>
         </w:rPr>
-        <w:t xml:space="preserve">Local AI</w:t>
-      </w:r>
-      <w:r>
-        <w:rPr>
-          <w:rFonts w:ascii="Calibri" w:cs="Calibri" w:eastAsia="Calibri" w:hAnsi="Calibri"/>
-          <w:sz w:val="20"/>
-          <w:szCs w:val="20"/>
-        </w:rPr>
-        <w:t xml:space="preserve">	Ollama (local LLMs, customization and fine-tuning experiments), LTX (video generation), mflux / FLUX (image generation)</w:t>
+        <w:t xml:space="preserve">Architecture &amp; Lead</w:t>
+      </w:r>
+      <w:r>
+        <w:rPr>
+          <w:rFonts w:ascii="Calibri" w:cs="Calibri" w:eastAsia="Calibri" w:hAnsi="Calibri"/>
+          <w:sz w:val="20"/>
+          <w:szCs w:val="20"/>
+        </w:rPr>
+        <w:t xml:space="preserve">	Solution and system architecture, technology selection, stakeholder requirements, technical risk management, code review, mentoring, team leadership</w:t>
       </w:r>
     </w:p>
     <w:p>
@@ -338,15 +338,15 @@
           <w:sz w:val="20"/>
           <w:szCs w:val="20"/>
         </w:rPr>
-        <w:t xml:space="preserve">Database &amp; Infra</w:t>
-      </w:r>
-      <w:r>
-        <w:rPr>
-          <w:rFonts w:ascii="Calibri" w:cs="Calibri" w:eastAsia="Calibri" w:hAnsi="Calibri"/>
-          <w:sz w:val="20"/>
-          <w:szCs w:val="20"/>
-        </w:rPr>
-        <w:t xml:space="preserve">	MySQL, PostgreSQL (schema design, query optimization) · Docker, Server Setup, CI/CD</w:t>
+        <w:t xml:space="preserve">Languages</w:t>
+      </w:r>
+      <w:r>
+        <w:rPr>
+          <w:rFonts w:ascii="Calibri" w:cs="Calibri" w:eastAsia="Calibri" w:hAnsi="Calibri"/>
+          <w:sz w:val="20"/>
+          <w:szCs w:val="20"/>
+        </w:rPr>
+        <w:t xml:space="preserve">	PHP 8 (proficient), TypeScript, JavaScript, Python, SQL, jQuery, HTML/CSS/SCSS</w:t>
       </w:r>
     </w:p>
     <w:p>
@@ -365,15 +365,96 @@
           <w:sz w:val="20"/>
           <w:szCs w:val="20"/>
         </w:rPr>
-        <w:t xml:space="preserve">DevOps &amp; Tools</w:t>
-      </w:r>
-      <w:r>
-        <w:rPr>
-          <w:rFonts w:ascii="Calibri" w:cs="Calibri" w:eastAsia="Calibri" w:hAnsi="Calibri"/>
-          <w:sz w:val="20"/>
-          <w:szCs w:val="20"/>
-        </w:rPr>
-        <w:t xml:space="preserve">	AWS SNS, GCS, Firebase, Vercel, Netlify, Jenkins, Git, GitHub, Postman, VS Code</w:t>
+        <w:t xml:space="preserve">Backend &amp; Data</w:t>
+      </w:r>
+      <w:r>
+        <w:rPr>
+          <w:rFonts w:ascii="Calibri" w:cs="Calibri" w:eastAsia="Calibri" w:hAnsi="Calibri"/>
+          <w:sz w:val="20"/>
+          <w:szCs w:val="20"/>
+        </w:rPr>
+        <w:t xml:space="preserve">	Node.js, NestJS, Laravel, CakePHP, CodeIgniter, REST APIs, MVC, MySQL, PostgreSQL (schema design, query optimization), Prisma, Redis / BullMQ</w:t>
+      </w:r>
+    </w:p>
+    <w:p>
+      <w:pPr>
+        <w:tabs>
+          <w:tab w:val="left" w:pos="1900"/>
+        </w:tabs>
+        <w:spacing w:after="25"/>
+        <w:ind w:left="1900" w:hanging="1900"/>
+      </w:pPr>
+      <w:r>
+        <w:rPr>
+          <w:rFonts w:ascii="Calibri" w:cs="Calibri" w:eastAsia="Calibri" w:hAnsi="Calibri"/>
+          <w:b/>
+          <w:bCs/>
+          <w:sz w:val="20"/>
+          <w:szCs w:val="20"/>
+        </w:rPr>
+        <w:t xml:space="preserve">Frontend</w:t>
+      </w:r>
+      <w:r>
+        <w:rPr>
+          <w:rFonts w:ascii="Calibri" w:cs="Calibri" w:eastAsia="Calibri" w:hAnsi="Calibri"/>
+          <w:sz w:val="20"/>
+          <w:szCs w:val="20"/>
+        </w:rPr>
+        <w:t xml:space="preserve">	React.js, Next.js, Vue.js, React Native, Tailwind CSS, Bootstrap</w:t>
+      </w:r>
+    </w:p>
+    <w:p>
+      <w:pPr>
+        <w:tabs>
+          <w:tab w:val="left" w:pos="1900"/>
+        </w:tabs>
+        <w:spacing w:after="25"/>
+        <w:ind w:left="1900" w:hanging="1900"/>
+      </w:pPr>
+      <w:r>
+        <w:rPr>
+          <w:rFonts w:ascii="Calibri" w:cs="Calibri" w:eastAsia="Calibri" w:hAnsi="Calibri"/>
+          <w:b/>
+          <w:bCs/>
+          <w:sz w:val="20"/>
+          <w:szCs w:val="20"/>
+        </w:rPr>
+        <w:t xml:space="preserve">Cloud &amp; DevOps</w:t>
+      </w:r>
+      <w:r>
+        <w:rPr>
+          <w:rFonts w:ascii="Calibri" w:cs="Calibri" w:eastAsia="Calibri" w:hAnsi="Calibri"/>
+          <w:sz w:val="20"/>
+          <w:szCs w:val="20"/>
+        </w:rPr>
+        <w:t xml:space="preserve">	Docker, CI/CD (Jenkins), AWS SNS, Google Cloud Storage, Firebase, Vercel, Netlify, server setup, Git, GitHub, Postman</w:t>
+      </w:r>
+    </w:p>
+    <w:p>
+      <w:pPr>
+        <w:tabs>
+          <w:tab w:val="left" w:pos="1900"/>
+        </w:tabs>
+        <w:spacing w:after="25"/>
+        <w:ind w:left="1900" w:hanging="1900"/>
+      </w:pPr>
+      <w:r>
+        <w:rPr>
+          <w:rFonts w:ascii="Calibri" w:cs="Calibri" w:eastAsia="Calibri" w:hAnsi="Calibri"/>
+          <w:b/>
+          <w:bCs/>
+          <w:sz w:val="20"/>
+          <w:szCs w:val="20"/>
+        </w:rPr>
+        <w:t xml:space="preserve">Secure AI Practices</w:t>
+      </w:r>
+      <w:r>
+        <w:rPr>
+          <w:rFonts w:ascii="Calibri" w:cs="Calibri" w:eastAsia="Calibri" w:hAnsi="Calibri"/>
+          <w:sz w:val="20"/>
+          <w:szCs w:val="20"/>
+        </w:rPr>
+        <w:t xml:space="preserve">	Untrusted-input handling and prompt-injection-aware design, answers restricted to approved data, local-model options for privacy, secure payment-gateway integration</w:t>
       </w:r>
     </w:p>
     <w:p>
@@ -382,7 +463,7 @@
         <w:pBdr>
           <w:bottom w:val="single" w:color="BBBBBB" w:sz="6" w:space="2"/>
         </w:pBdr>
-        <w:spacing w:after="70" w:before="200"/>
+        <w:spacing w:after="60" w:before="140"/>
       </w:pPr>
       <w:r>
         <w:rPr>
@@ -438,115 +519,97 @@
           <w:sz w:val="20"/>
           <w:szCs w:val="20"/>
         </w:rPr>
-        <w:t xml:space="preserve">Lead the AI development team building production AI chat-support chatbots and automation workflows using Dify and n8n, designing enterprise-grade architectures focused on security, modularity and high performance.</w:t>
-      </w:r>
-    </w:p>
-    <w:p>
-      <w:pPr>
-        <w:pStyle w:val="ListParagraph"/>
-        <w:numPr>
-          <w:ilvl w:val="0"/>
-          <w:numId w:val="2"/>
-        </w:numPr>
-        <w:spacing w:after="30"/>
-      </w:pPr>
-      <w:r>
-        <w:rPr>
-          <w:rFonts w:ascii="Calibri" w:cs="Calibri" w:eastAsia="Calibri" w:hAnsi="Calibri"/>
-          <w:sz w:val="20"/>
-          <w:szCs w:val="20"/>
-        </w:rPr>
-        <w:t xml:space="preserve">Integrate AI into existing systems, including AI coaching and AI features for NativeCamp, an online English conversation platform serving the Japanese market with unlimited 24/7 live lessons; resolved critical bugs and delivered multiple feature tickets as Solutions Architect.</w:t>
-      </w:r>
-    </w:p>
-    <w:p>
-      <w:pPr>
-        <w:pStyle w:val="ListParagraph"/>
-        <w:numPr>
-          <w:ilvl w:val="0"/>
-          <w:numId w:val="2"/>
-        </w:numPr>
-        <w:spacing w:after="30"/>
-      </w:pPr>
-      <w:r>
-        <w:rPr>
-          <w:rFonts w:ascii="Calibri" w:cs="Calibri" w:eastAsia="Calibri" w:hAnsi="Calibri"/>
-          <w:sz w:val="20"/>
-          <w:szCs w:val="20"/>
-        </w:rPr>
-        <w:t xml:space="preserve">Apply Prompt Engineering to optimize AI model outputs for real-world use cases, enabling intelligent automation that reduced manual workloads significantly.</w:t>
-      </w:r>
-    </w:p>
-    <w:p>
-      <w:pPr>
-        <w:pStyle w:val="ListParagraph"/>
-        <w:numPr>
-          <w:ilvl w:val="0"/>
-          <w:numId w:val="2"/>
-        </w:numPr>
-        <w:spacing w:after="30"/>
-      </w:pPr>
-      <w:r>
-        <w:rPr>
-          <w:rFonts w:ascii="Calibri" w:cs="Calibri" w:eastAsia="Calibri" w:hAnsi="Calibri"/>
-          <w:sz w:val="20"/>
-          <w:szCs w:val="20"/>
-        </w:rPr>
-        <w:t xml:space="preserve">Run the team's development process with Spec Kit (spec-driven development) and Claude-based AI coding agents, so each feature starts from a clear spec, plan and task breakdown.</w:t>
-      </w:r>
-    </w:p>
-    <w:p>
-      <w:pPr>
-        <w:pStyle w:val="ListParagraph"/>
-        <w:numPr>
-          <w:ilvl w:val="0"/>
-          <w:numId w:val="2"/>
-        </w:numPr>
-        <w:spacing w:after="30"/>
-      </w:pPr>
-      <w:r>
-        <w:rPr>
-          <w:rFonts w:ascii="Calibri" w:cs="Calibri" w:eastAsia="Calibri" w:hAnsi="Calibri"/>
-          <w:sz w:val="20"/>
-          <w:szCs w:val="20"/>
-        </w:rPr>
-        <w:t xml:space="preserve">Collaborate with stakeholders, business analysts and clients to translate business requirements into technical architecture and design specifications.</w:t>
-      </w:r>
-    </w:p>
-    <w:p>
-      <w:pPr>
-        <w:pStyle w:val="ListParagraph"/>
-        <w:numPr>
-          <w:ilvl w:val="0"/>
-          <w:numId w:val="2"/>
-        </w:numPr>
-        <w:spacing w:after="30"/>
-      </w:pPr>
-      <w:r>
-        <w:rPr>
-          <w:rFonts w:ascii="Calibri" w:cs="Calibri" w:eastAsia="Calibri" w:hAnsi="Calibri"/>
-          <w:sz w:val="20"/>
-          <w:szCs w:val="20"/>
-        </w:rPr>
-        <w:t xml:space="preserve">Evaluate and recommend technology stacks and architectural patterns; conduct code reviews and daily standups; mentor junior developers on architectural best practices.</w:t>
-      </w:r>
-    </w:p>
-    <w:p>
-      <w:pPr>
-        <w:pStyle w:val="ListParagraph"/>
-        <w:numPr>
-          <w:ilvl w:val="0"/>
-          <w:numId w:val="2"/>
-        </w:numPr>
-        <w:spacing w:after="30"/>
-      </w:pPr>
-      <w:r>
-        <w:rPr>
-          <w:rFonts w:ascii="Calibri" w:cs="Calibri" w:eastAsia="Calibri" w:hAnsi="Calibri"/>
-          <w:sz w:val="20"/>
-          <w:szCs w:val="20"/>
-        </w:rPr>
-        <w:t xml:space="preserve">Identify technical risks early and develop mitigation strategies to protect project quality and timelines.</w:t>
+        <w:t xml:space="preserve">Lead the AI development team building production AI chat-support chatbots and automation workflows with Dify and n8n, designing enterprise-grade architectures focused on security, modularity and high performance.</w:t>
+      </w:r>
+    </w:p>
+    <w:p>
+      <w:pPr>
+        <w:pStyle w:val="ListParagraph"/>
+        <w:numPr>
+          <w:ilvl w:val="0"/>
+          <w:numId w:val="2"/>
+        </w:numPr>
+        <w:spacing w:after="30"/>
+      </w:pPr>
+      <w:r>
+        <w:rPr>
+          <w:rFonts w:ascii="Calibri" w:cs="Calibri" w:eastAsia="Calibri" w:hAnsi="Calibri"/>
+          <w:sz w:val="20"/>
+          <w:szCs w:val="20"/>
+        </w:rPr>
+        <w:t xml:space="preserve">Integrate AI into existing applications, including AI coaching and AI features for NativeCamp, an online English conversation platform for the Japanese market with unlimited 24/7 live lessons; resolved critical bugs and delivered multiple feature tickets as Solutions Architect.</w:t>
+      </w:r>
+    </w:p>
+    <w:p>
+      <w:pPr>
+        <w:pStyle w:val="ListParagraph"/>
+        <w:numPr>
+          <w:ilvl w:val="0"/>
+          <w:numId w:val="2"/>
+        </w:numPr>
+        <w:spacing w:after="30"/>
+      </w:pPr>
+      <w:r>
+        <w:rPr>
+          <w:rFonts w:ascii="Calibri" w:cs="Calibri" w:eastAsia="Calibri" w:hAnsi="Calibri"/>
+          <w:sz w:val="20"/>
+          <w:szCs w:val="20"/>
+        </w:rPr>
+        <w:t xml:space="preserve">Apply prompt engineering to optimize model outputs for real-world use cases, enabling intelligent automation that significantly reduced manual workloads.</w:t>
+      </w:r>
+    </w:p>
+    <w:p>
+      <w:pPr>
+        <w:pStyle w:val="ListParagraph"/>
+        <w:numPr>
+          <w:ilvl w:val="0"/>
+          <w:numId w:val="2"/>
+        </w:numPr>
+        <w:spacing w:after="30"/>
+      </w:pPr>
+      <w:r>
+        <w:rPr>
+          <w:rFonts w:ascii="Calibri" w:cs="Calibri" w:eastAsia="Calibri" w:hAnsi="Calibri"/>
+          <w:sz w:val="20"/>
+          <w:szCs w:val="20"/>
+        </w:rPr>
+        <w:t xml:space="preserve">Run the team's development process with Spec Kit (spec-driven development) and Claude Code, so each feature starts from a clear spec, plan and task breakdown, improving developer productivity with AI-assisted engineering.</w:t>
+      </w:r>
+    </w:p>
+    <w:p>
+      <w:pPr>
+        <w:pStyle w:val="ListParagraph"/>
+        <w:numPr>
+          <w:ilvl w:val="0"/>
+          <w:numId w:val="2"/>
+        </w:numPr>
+        <w:spacing w:after="30"/>
+      </w:pPr>
+      <w:r>
+        <w:rPr>
+          <w:rFonts w:ascii="Calibri" w:cs="Calibri" w:eastAsia="Calibri" w:hAnsi="Calibri"/>
+          <w:sz w:val="20"/>
+          <w:szCs w:val="20"/>
+        </w:rPr>
+        <w:t xml:space="preserve">Work directly with stakeholders, business analysts and clients to turn business problems into technical architecture and design specifications; recommend technology stacks and architectural patterns.</w:t>
+      </w:r>
+    </w:p>
+    <w:p>
+      <w:pPr>
+        <w:pStyle w:val="ListParagraph"/>
+        <w:numPr>
+          <w:ilvl w:val="0"/>
+          <w:numId w:val="2"/>
+        </w:numPr>
+        <w:spacing w:after="30"/>
+      </w:pPr>
+      <w:r>
+        <w:rPr>
+          <w:rFonts w:ascii="Calibri" w:cs="Calibri" w:eastAsia="Calibri" w:hAnsi="Calibri"/>
+          <w:sz w:val="20"/>
+          <w:szCs w:val="20"/>
+        </w:rPr>
+        <w:t xml:space="preserve">Conduct code reviews and daily standups, mentor junior developers, and identify technical risks early with mitigation plans to protect quality and timelines.</w:t>
       </w:r>
     </w:p>
     <w:p>
@@ -592,43 +655,43 @@
           <w:sz w:val="20"/>
           <w:szCs w:val="20"/>
         </w:rPr>
-        <w:t xml:space="preserve">Led full-cycle software development from planning and design to testing, deployment and maintenance, ensuring operational feasibility through detailed specifications.</w:t>
-      </w:r>
-    </w:p>
-    <w:p>
-      <w:pPr>
-        <w:pStyle w:val="ListParagraph"/>
-        <w:numPr>
-          <w:ilvl w:val="0"/>
-          <w:numId w:val="2"/>
-        </w:numPr>
-        <w:spacing w:after="30"/>
-      </w:pPr>
-      <w:r>
-        <w:rPr>
-          <w:rFonts w:ascii="Calibri" w:cs="Calibri" w:eastAsia="Calibri" w:hAnsi="Calibri"/>
-          <w:sz w:val="20"/>
-          <w:szCs w:val="20"/>
-        </w:rPr>
-        <w:t xml:space="preserve">Built Ignitesales, a marketing platform with LinkedIn-sourced company and contact data featuring smart employee filtering, email campaign creation and contact assignment. Stack: Node.js, Next.js, React.js, Tailwind CSS, PostgreSQL, NestJS.</w:t>
-      </w:r>
-    </w:p>
-    <w:p>
-      <w:pPr>
-        <w:pStyle w:val="ListParagraph"/>
-        <w:numPr>
-          <w:ilvl w:val="0"/>
-          <w:numId w:val="2"/>
-        </w:numPr>
-        <w:spacing w:after="30"/>
-      </w:pPr>
-      <w:r>
-        <w:rPr>
-          <w:rFonts w:ascii="Calibri" w:cs="Calibri" w:eastAsia="Calibri" w:hAnsi="Calibri"/>
-          <w:sz w:val="20"/>
-          <w:szCs w:val="20"/>
-        </w:rPr>
-        <w:t xml:space="preserve">Produced efficient, testable code and resolved database performance and capacity issues, optimizing application performance.</w:t>
+        <w:t xml:space="preserve">Led full-cycle delivery from planning and design to testing, deployment and maintenance.</w:t>
+      </w:r>
+    </w:p>
+    <w:p>
+      <w:pPr>
+        <w:pStyle w:val="ListParagraph"/>
+        <w:numPr>
+          <w:ilvl w:val="0"/>
+          <w:numId w:val="2"/>
+        </w:numPr>
+        <w:spacing w:after="30"/>
+      </w:pPr>
+      <w:r>
+        <w:rPr>
+          <w:rFonts w:ascii="Calibri" w:cs="Calibri" w:eastAsia="Calibri" w:hAnsi="Calibri"/>
+          <w:sz w:val="20"/>
+          <w:szCs w:val="20"/>
+        </w:rPr>
+        <w:t xml:space="preserve">Built Ignitesales, a B2B marketing platform with LinkedIn-sourced company and contact data, smart filtering, email campaigns and contact assignment (Node.js, Next.js, React.js, Tailwind CSS, PostgreSQL, NestJS).</w:t>
+      </w:r>
+    </w:p>
+    <w:p>
+      <w:pPr>
+        <w:pStyle w:val="ListParagraph"/>
+        <w:numPr>
+          <w:ilvl w:val="0"/>
+          <w:numId w:val="2"/>
+        </w:numPr>
+        <w:spacing w:after="30"/>
+      </w:pPr>
+      <w:r>
+        <w:rPr>
+          <w:rFonts w:ascii="Calibri" w:cs="Calibri" w:eastAsia="Calibri" w:hAnsi="Calibri"/>
+          <w:sz w:val="20"/>
+          <w:szCs w:val="20"/>
+        </w:rPr>
+        <w:t xml:space="preserve">Resolved database performance and capacity issues and produced efficient, testable code.</w:t>
       </w:r>
     </w:p>
     <w:p>
@@ -674,43 +737,25 @@
           <w:sz w:val="20"/>
           <w:szCs w:val="20"/>
         </w:rPr>
-        <w:t xml:space="preserve">Discussed client website design and requirements, creating process flows for seamless feature integration.</w:t>
-      </w:r>
-    </w:p>
-    <w:p>
-      <w:pPr>
-        <w:pStyle w:val="ListParagraph"/>
-        <w:numPr>
-          <w:ilvl w:val="0"/>
-          <w:numId w:val="2"/>
-        </w:numPr>
-        <w:spacing w:after="30"/>
-      </w:pPr>
-      <w:r>
-        <w:rPr>
-          <w:rFonts w:ascii="Calibri" w:cs="Calibri" w:eastAsia="Calibri" w:hAnsi="Calibri"/>
-          <w:sz w:val="20"/>
-          <w:szCs w:val="20"/>
-        </w:rPr>
-        <w:t xml:space="preserve">Managed website maintenance, scalability and contingency plans for uninterrupted service; maintained software documentation.</w:t>
-      </w:r>
-    </w:p>
-    <w:p>
-      <w:pPr>
-        <w:pStyle w:val="ListParagraph"/>
-        <w:numPr>
-          <w:ilvl w:val="0"/>
-          <w:numId w:val="2"/>
-        </w:numPr>
-        <w:spacing w:after="30"/>
-      </w:pPr>
-      <w:r>
-        <w:rPr>
-          <w:rFonts w:ascii="Calibri" w:cs="Calibri" w:eastAsia="Calibri" w:hAnsi="Calibri"/>
-          <w:sz w:val="20"/>
-          <w:szCs w:val="20"/>
-        </w:rPr>
-        <w:t xml:space="preserve">Delivered the 8990 FTDH Billing System and Gakkou School Management System using PHP, Laravel, MySQL, Bootstrap.</w:t>
+        <w:t xml:space="preserve">Gathered client requirements, created process flows and delivered the 8990 FTDH Billing System and Gakkou School Management System (PHP, Laravel, MySQL, Bootstrap).</w:t>
+      </w:r>
+    </w:p>
+    <w:p>
+      <w:pPr>
+        <w:pStyle w:val="ListParagraph"/>
+        <w:numPr>
+          <w:ilvl w:val="0"/>
+          <w:numId w:val="2"/>
+        </w:numPr>
+        <w:spacing w:after="30"/>
+      </w:pPr>
+      <w:r>
+        <w:rPr>
+          <w:rFonts w:ascii="Calibri" w:cs="Calibri" w:eastAsia="Calibri" w:hAnsi="Calibri"/>
+          <w:sz w:val="20"/>
+          <w:szCs w:val="20"/>
+        </w:rPr>
+        <w:t xml:space="preserve">Owned website maintenance, scalability, contingency plans and software documentation.</w:t>
       </w:r>
     </w:p>
     <w:p>
@@ -756,25 +801,7 @@
           <w:sz w:val="20"/>
           <w:szCs w:val="20"/>
         </w:rPr>
-        <w:t xml:space="preserve">Built websites using PHP, HTML and CSS following industry standards and best practices.</w:t>
-      </w:r>
-    </w:p>
-    <w:p>
-      <w:pPr>
-        <w:pStyle w:val="ListParagraph"/>
-        <w:numPr>
-          <w:ilvl w:val="0"/>
-          <w:numId w:val="2"/>
-        </w:numPr>
-        <w:spacing w:after="30"/>
-      </w:pPr>
-      <w:r>
-        <w:rPr>
-          <w:rFonts w:ascii="Calibri" w:cs="Calibri" w:eastAsia="Calibri" w:hAnsi="Calibri"/>
-          <w:sz w:val="20"/>
-          <w:szCs w:val="20"/>
-        </w:rPr>
-        <w:t xml:space="preserve">Assisted in designing, testing and maintaining web applications; collaborated with the team to implement new features and stayed current with technology trends.</w:t>
+        <w:t xml:space="preserve">Built, tested and maintained PHP web applications with a collaborative team, following industry best practices.</w:t>
       </w:r>
     </w:p>
     <w:p>
@@ -783,7 +810,7 @@
         <w:pBdr>
           <w:bottom w:val="single" w:color="BBBBBB" w:sz="6" w:space="2"/>
         </w:pBdr>
-        <w:spacing w:after="70" w:before="200"/>
+        <w:spacing w:after="60" w:before="140"/>
       </w:pPr>
       <w:r>
         <w:rPr>
@@ -849,25 +876,25 @@
           <w:sz w:val="21"/>
           <w:szCs w:val="21"/>
         </w:rPr>
-        <w:t xml:space="preserve">Inkwell Studio — AI YouTube Content Automation (Personal Project)</w:t>
-      </w:r>
-    </w:p>
-    <w:p>
-      <w:pPr>
-        <w:pStyle w:val="ListParagraph"/>
-        <w:numPr>
-          <w:ilvl w:val="0"/>
-          <w:numId w:val="2"/>
-        </w:numPr>
-        <w:spacing w:after="30"/>
-      </w:pPr>
-      <w:r>
-        <w:rPr>
-          <w:rFonts w:ascii="Calibri" w:cs="Calibri" w:eastAsia="Calibri" w:hAnsi="Calibri"/>
-          <w:sz w:val="20"/>
-          <w:szCs w:val="20"/>
-        </w:rPr>
-        <w:t xml:space="preserve">Local video workshop that runs AI-generated faceless YouTube channels end to end: AI script writing, approval, scene planning, AI picture generation, AI voice, Remotion rendering and packaging, with scheduling and autopilot across 4 channels. Uses Gemini plus local models (mflux for images, LTX for video, Ollama for LLM experiments). TypeScript / Node.js.</w:t>
+        <w:t xml:space="preserve">Tubag AI (formerly AutoFlow AI) — AI Customer-Chat Agent for Appointment-Based Businesses (Personal Product)</w:t>
+      </w:r>
+    </w:p>
+    <w:p>
+      <w:pPr>
+        <w:pStyle w:val="ListParagraph"/>
+        <w:numPr>
+          <w:ilvl w:val="0"/>
+          <w:numId w:val="2"/>
+        </w:numPr>
+        <w:spacing w:after="30"/>
+      </w:pPr>
+      <w:r>
+        <w:rPr>
+          <w:rFonts w:ascii="Calibri" w:cs="Calibri" w:eastAsia="Calibri" w:hAnsi="Calibri"/>
+          <w:sz w:val="20"/>
+          <w:szCs w:val="20"/>
+        </w:rPr>
+        <w:t xml:space="preserve">Embeddable website chat agent on Claude or Gemini behind a provider abstraction, with automatic retries. Uses tool calling for knowledge-base search, service lookup, real availability checks, booking, rescheduling, lead capture and human hand-off. Answers only from the business's own approved knowledge base and treats customer input as untrusted (prompt-injection aware). Next.js, TypeScript, PostgreSQL, Prisma, Redis/BullMQ, Docker. tubagai.com</w:t>
       </w:r>
     </w:p>
     <w:p>
@@ -886,25 +913,25 @@
           <w:sz w:val="21"/>
           <w:szCs w:val="21"/>
         </w:rPr>
-        <w:t xml:space="preserve">Wordspark.ai — AI Blog Creation Platform (UK Client)</w:t>
-      </w:r>
-    </w:p>
-    <w:p>
-      <w:pPr>
-        <w:pStyle w:val="ListParagraph"/>
-        <w:numPr>
-          <w:ilvl w:val="0"/>
-          <w:numId w:val="2"/>
-        </w:numPr>
-        <w:spacing w:after="30"/>
-      </w:pPr>
-      <w:r>
-        <w:rPr>
-          <w:rFonts w:ascii="Calibri" w:cs="Calibri" w:eastAsia="Calibri" w:hAnsi="Calibri"/>
-          <w:sz w:val="20"/>
-          <w:szCs w:val="20"/>
-        </w:rPr>
-        <w:t xml:space="preserve">Node.js, Express.js, AI API integration, Unsplash API. Generates fully formatted, image-rich blog posts in under 60 seconds with API flexibility and secure user content control. Live at wordspark.ai</w:t>
+        <w:t xml:space="preserve">Jay — Local Voice AI Assistant (Personal Project)</w:t>
+      </w:r>
+    </w:p>
+    <w:p>
+      <w:pPr>
+        <w:pStyle w:val="ListParagraph"/>
+        <w:numPr>
+          <w:ilvl w:val="0"/>
+          <w:numId w:val="2"/>
+        </w:numPr>
+        <w:spacing w:after="30"/>
+      </w:pPr>
+      <w:r>
+        <w:rPr>
+          <w:rFonts w:ascii="Calibri" w:cs="Calibri" w:eastAsia="Calibri" w:hAnsi="Calibri"/>
+          <w:sz w:val="20"/>
+          <w:szCs w:val="20"/>
+        </w:rPr>
+        <w:t xml:space="preserve">Python voice assistant: wake phrase, local speech-to-text (faster-whisper), an Ollama tool-calling loop (app control, files, Slack summaries, web search), persistent memory and spoken replies. Runs fully local by default and can escalate hard questions to the Claude API.</w:t>
       </w:r>
     </w:p>
     <w:p>
@@ -923,6 +950,80 @@
           <w:sz w:val="21"/>
           <w:szCs w:val="21"/>
         </w:rPr>
+        <w:t xml:space="preserve">Inkwell Studio — AI Content Automation Pipeline (Personal Project)</w:t>
+      </w:r>
+    </w:p>
+    <w:p>
+      <w:pPr>
+        <w:pStyle w:val="ListParagraph"/>
+        <w:numPr>
+          <w:ilvl w:val="0"/>
+          <w:numId w:val="2"/>
+        </w:numPr>
+        <w:spacing w:after="30"/>
+      </w:pPr>
+      <w:r>
+        <w:rPr>
+          <w:rFonts w:ascii="Calibri" w:cs="Calibri" w:eastAsia="Calibri" w:hAnsi="Calibri"/>
+          <w:sz w:val="20"/>
+          <w:szCs w:val="20"/>
+        </w:rPr>
+        <w:t xml:space="preserve">Multi-step AI workflow that runs faceless YouTube channels end to end: AI script writing, human approval, scene planning, AI image generation, AI voice, Remotion rendering and packaging, scheduling and autopilot across 4 channels. Gemini plus local mflux, LTX and Ollama. TypeScript / Node.js.</w:t>
+      </w:r>
+    </w:p>
+    <w:p>
+      <w:pPr>
+        <w:keepNext/>
+        <w:tabs>
+          <w:tab w:val="right" w:pos="10206"/>
+        </w:tabs>
+        <w:spacing w:after="30" w:before="90"/>
+      </w:pPr>
+      <w:r>
+        <w:rPr>
+          <w:rFonts w:ascii="Calibri" w:cs="Calibri" w:eastAsia="Calibri" w:hAnsi="Calibri"/>
+          <w:b/>
+          <w:bCs/>
+          <w:sz w:val="21"/>
+          <w:szCs w:val="21"/>
+        </w:rPr>
+        <w:t xml:space="preserve">Wordspark.ai — AI Blog Creation Platform (UK Client)</w:t>
+      </w:r>
+    </w:p>
+    <w:p>
+      <w:pPr>
+        <w:pStyle w:val="ListParagraph"/>
+        <w:numPr>
+          <w:ilvl w:val="0"/>
+          <w:numId w:val="2"/>
+        </w:numPr>
+        <w:spacing w:after="30"/>
+      </w:pPr>
+      <w:r>
+        <w:rPr>
+          <w:rFonts w:ascii="Calibri" w:cs="Calibri" w:eastAsia="Calibri" w:hAnsi="Calibri"/>
+          <w:sz w:val="20"/>
+          <w:szCs w:val="20"/>
+        </w:rPr>
+        <w:t xml:space="preserve">Node.js, Express.js, AI API integration, Unsplash API. Generates fully formatted, image-rich blog posts in under 60 seconds with API flexibility and secure user content control.</w:t>
+      </w:r>
+    </w:p>
+    <w:p>
+      <w:pPr>
+        <w:keepNext/>
+        <w:tabs>
+          <w:tab w:val="right" w:pos="10206"/>
+        </w:tabs>
+        <w:spacing w:after="30" w:before="90"/>
+      </w:pPr>
+      <w:r>
+        <w:rPr>
+          <w:rFonts w:ascii="Calibri" w:cs="Calibri" w:eastAsia="Calibri" w:hAnsi="Calibri"/>
+          <w:b/>
+          <w:bCs/>
+          <w:sz w:val="21"/>
+          <w:szCs w:val="21"/>
+        </w:rPr>
         <w:t xml:space="preserve">Ignitesales — B2B Marketing &amp; Sales Outreach Platform</w:t>
       </w:r>
     </w:p>
@@ -941,7 +1042,7 @@
           <w:sz w:val="20"/>
           <w:szCs w:val="20"/>
         </w:rPr>
-        <w:t xml:space="preserve">Node.js, Next.js, React.js, Tailwind CSS, PostgreSQL, NestJS. LinkedIn-sourced company/contact data with smart filtering, email campaigns and contact assignment. Live at ignitesales.app</w:t>
+        <w:t xml:space="preserve">Node.js, Next.js, React.js, Tailwind CSS, PostgreSQL, NestJS. LinkedIn-sourced company/contact data with smart filtering, email campaigns and contact assignment.</w:t>
       </w:r>
     </w:p>
     <w:p>
@@ -1061,7 +1162,7 @@
         <w:pBdr>
           <w:bottom w:val="single" w:color="BBBBBB" w:sz="6" w:space="2"/>
         </w:pBdr>
-        <w:spacing w:after="70" w:before="200"/>
+        <w:spacing w:after="60" w:before="140"/>
       </w:pPr>
       <w:r>
         <w:rPr>
@@ -1155,7 +1256,7 @@
         <w:pBdr>
           <w:bottom w:val="single" w:color="BBBBBB" w:sz="6" w:space="2"/>
         </w:pBdr>
-        <w:spacing w:after="70" w:before="200"/>
+        <w:spacing w:after="60" w:before="140"/>
       </w:pPr>
       <w:r>
         <w:rPr>
@@ -1228,7 +1329,7 @@
         <w:pBdr>
           <w:bottom w:val="single" w:color="BBBBBB" w:sz="6" w:space="2"/>
         </w:pBdr>
-        <w:spacing w:after="70" w:before="200"/>
+        <w:spacing w:after="60" w:before="140"/>
       </w:pPr>
       <w:r>
         <w:rPr>
@@ -1243,7 +1344,7 @@
     </w:p>
     <w:p>
       <w:pPr>
-        <w:spacing w:after="40" w:before="0"/>
+        <w:spacing w:after="40"/>
       </w:pPr>
       <w:r>
         <w:rPr>
@@ -1266,7 +1367,7 @@
     </w:p>
     <w:p>
       <w:pPr>
-        <w:spacing w:after="40" w:before="0"/>
+        <w:spacing w:after="40"/>
       </w:pPr>
       <w:r>
         <w:rPr>
@@ -1289,7 +1390,7 @@
     </w:p>
     <w:p>
       <w:pPr>
-        <w:spacing w:after="40" w:before="0"/>
+        <w:spacing w:after="40"/>
       </w:pPr>
       <w:r>
         <w:rPr>
@@ -1312,7 +1413,7 @@
     </w:p>
     <w:sectPr>
       <w:pgSz w:w="11906" w:h="16838" w:orient="portrait"/>
-      <w:pgMar w:top="850" w:right="850" w:bottom="850" w:left="850" w:header="708" w:footer="708" w:gutter="0"/>
+      <w:pgMar w:top="680" w:right="850" w:bottom="680" w:left="850" w:header="708" w:footer="708" w:gutter="0"/>
       <w:pgNumType/>
       <w:docGrid w:linePitch="360"/>
     </w:sectPr>

</xml_diff>